<commit_message>
Curso Classroom U6: cambiar prompt 3 (bodegón -> lonchera escolar saludable)
Co-Authored-By: Claude Opus 4.8 <noreply@anthropic.com>
Claude-Session: https://claude.ai/code/session_01Mmrn7JLAhSVspHUWxCQFPE
</commit_message>
<xml_diff>
--- a/ANA/Curso Classroom - Aplicaciones en la Nube/Actividad_U6_StableDiffusion_Gemini.docx
+++ b/ANA/Curso Classroom - Aplicaciones en la Nube/Actividad_U6_StableDiffusion_Gemini.docx
@@ -614,7 +614,7 @@
           <w:sz w:val="24"/>
           <w:szCs w:val="24"/>
         </w:rPr>
-        <w:t xml:space="preserve">Bodegón educativo de alimentos saludables sobre una mesa de madera: frutas, verduras, leguminosas (frijol y lenteja), cereales integrales y un vaso de agua natural, organizados por grupos de alimentos; estilo ilustración plana (flat design), colores vivos, aspecto limpio y didáctico.</w:t>
+        <w:t xml:space="preserve">Una lonchera escolar saludable abierta sobre una mesa: una manzana roja, un racimo de uvas, bastones de zanahoria y pepino, un sándwich de pan integral y una botella de agua natural; ilustración tipo caricatura para niños, colores vivos y alegres, fondo claro y formato horizontal.</w:t>
       </w:r>
     </w:p>
     <w:p>
@@ -966,7 +966,7 @@
                 <w:sz w:val="16"/>
                 <w:szCs w:val="16"/>
               </w:rPr>
-              <w:t xml:space="preserve">Bodegón por grupos</w:t>
+              <w:t xml:space="preserve">Lonchera saludable</w:t>
             </w:r>
           </w:p>
         </w:tc>

</xml_diff>